<commit_message>
Saca al comisario de la imagen del sello
El render real con Word destapo lo que la lectura del XML no veia: el
bloque de firma del pie no era texto sino una imagen, con el nombre
escrito a fuego. Tal cual, TODOS los oficios habrian salido firmados por
el comisario que estaba el dia que se hizo la plantilla, sin importar
quien firme de verdad.

Ahora la imagen se recorta al sello y los cuatro renglones (OA, nombre,
grado y cargo) son campos que salen del comisario que se confirma al
generar. El sello redondo se conserva igual.

El dialogo gana el N.º OA y el cargo, que tambien quedan recordados.

23 pruebas del oficio; 375 en total.

Co-Authored-By: Claude Opus 5 <noreply@anthropic.com>
</commit_message>
<xml_diff>
--- a/plantillas/plantilla_oficio_remision.docx
+++ b/plantillas/plantilla_oficio_remision.docx
@@ -33,7 +33,7 @@
           <w:sz w:val="24"/>
           <w:szCs w:val="24"/>
         </w:rPr>
-        <w:t xml:space="preserve">Ventanilla, {fecha}</w:t>
+        <w:t>Ventanilla, {fecha}</w:t>
       </w:r>
     </w:p>
     <w:p>
@@ -59,7 +59,7 @@
           <w:u w:val="single"/>
           <w:lang w:eastAsia="es-ES"/>
         </w:rPr>
-        <w:t xml:space="preserve">OFICIO N°{numero_oficio}-COMOPPOL-PNP/DIRNOS/REGPOL-CALL/DIVOPUS-VENTANILLA-COM VENTANILLA “A”.MYD</w:t>
+        <w:t>OFICIO N°{numero_oficio}-COMOPPOL-PNP/DIRNOS/REGPOL-CALL/DIVOPUS-VENTANILLA-COM VENTANILLA “A”.MYD</w:t>
       </w:r>
     </w:p>
     <w:p>
@@ -126,7 +126,7 @@
           <w:sz w:val="24"/>
           <w:szCs w:val="24"/>
         </w:rPr>
-        <w:t xml:space="preserve">{jefe_grado}</w:t>
+        <w:t>{jefe_grado}</w:t>
       </w:r>
     </w:p>
     <w:p>
@@ -287,7 +287,7 @@
           <w:sz w:val="24"/>
           <w:szCs w:val="24"/>
         </w:rPr>
-        <w:t xml:space="preserve">Orden de sanción, impuesta a personal PNP, por motivo que se indica. -</w:t>
+        <w:t>Orden de sanción, impuesta a personal PNP, por motivo que se indica. -</w:t>
       </w:r>
       <w:r>
         <w:rPr>
@@ -334,7 +334,7 @@
           <w:sz w:val="24"/>
           <w:szCs w:val="24"/>
         </w:rPr>
-        <w:t xml:space="preserve">REF.             :          LEY N° 30714 y su Reglamento D.S 003-2020-IN</w:t>
+        <w:t>REF.             :          LEY N° 30714 y su Reglamento D.S 003-2020-IN</w:t>
       </w:r>
     </w:p>
     <w:p>
@@ -387,7 +387,7 @@
           <w:sz w:val="24"/>
           <w:szCs w:val="24"/>
         </w:rPr>
-        <w:t xml:space="preserve">Es propicia la oportunidad para expresarle los sentimientos de mi especial consideración y deferente estima personal.</w:t>
+        <w:t>Es propicia la oportunidad para expresarle los sentimientos de mi especial consideración y deferente estima personal.</w:t>
       </w:r>
       <w:r>
         <w:rPr>
@@ -433,7 +433,7 @@
         <w:rPr>
           <w:lang w:val="es-PE"/>
         </w:rPr>
-        <w:t xml:space="preserve">{iniciales}</w:t>
+        <w:t>{iniciales}</w:t>
       </w:r>
     </w:p>
     <w:p>
@@ -466,7 +466,10 @@
     <w:p>
       <w:pPr>
         <w:pStyle w:val="Textoindependiente2"/>
-        <w:ind w:left="5664" w:firstLine="290"/>
+        <w:pBdr>
+          <w:bottom w:val="single" w:sz="8" w:space="1" w:color="auto"/>
+        </w:pBdr>
+        <w:ind w:left="5760" w:firstLine="290"/>
         <w:rPr>
           <w:lang w:val="es-PE"/>
         </w:rPr>
@@ -478,20 +481,20 @@
           <w:szCs w:val="24"/>
         </w:rPr>
         <w:drawing>
-          <wp:anchor distT="0" distB="0" distL="114300" distR="114300" simplePos="0" relativeHeight="251658240" behindDoc="0" locked="0" layoutInCell="1" allowOverlap="1" wp14:anchorId="654AC784" wp14:editId="5EA418BE">
+          <wp:anchor distT="0" distB="0" distL="114300" distR="114300" simplePos="0" relativeHeight="251658240" behindDoc="0" locked="0" layoutInCell="1" allowOverlap="1" wp14:anchorId="654AC784" wp14:editId="2736FB8C">
             <wp:simplePos x="0" y="0"/>
             <wp:positionH relativeFrom="column">
-              <wp:posOffset>2642870</wp:posOffset>
+              <wp:posOffset>2640965</wp:posOffset>
             </wp:positionH>
             <wp:positionV relativeFrom="paragraph">
-              <wp:posOffset>5715</wp:posOffset>
+              <wp:posOffset>9525</wp:posOffset>
             </wp:positionV>
-            <wp:extent cx="2938780" cy="1530350"/>
-            <wp:effectExtent l="0" t="0" r="0" b="0"/>
+            <wp:extent cx="1116581" cy="1530350"/>
+            <wp:effectExtent l="0" t="0" r="7620" b="0"/>
             <wp:wrapNone/>
             <wp:docPr id="1707320208" name="Imagen 13"/>
             <wp:cNvGraphicFramePr>
-              <a:graphicFrameLocks xmlns:a="http://schemas.openxmlformats.org/drawingml/2006/main" noChangeAspect="1"/>
+              <a:graphicFrameLocks xmlns:a="http://schemas.openxmlformats.org/drawingml/2006/main"/>
             </wp:cNvGraphicFramePr>
             <a:graphic xmlns:a="http://schemas.openxmlformats.org/drawingml/2006/main">
               <a:graphicData uri="http://schemas.openxmlformats.org/drawingml/2006/picture">
@@ -510,7 +513,7 @@
                         </a:ext>
                       </a:extLst>
                     </a:blip>
-                    <a:srcRect/>
+                    <a:srcRect r="62005"/>
                     <a:stretch>
                       <a:fillRect/>
                     </a:stretch>
@@ -518,7 +521,7 @@
                   <pic:spPr bwMode="auto">
                     <a:xfrm>
                       <a:off x="0" y="0"/>
-                      <a:ext cx="2938780" cy="1530350"/>
+                      <a:ext cx="1116581" cy="1530350"/>
                     </a:xfrm>
                     <a:prstGeom prst="rect">
                       <a:avLst/>
@@ -528,6 +531,9 @@
                 </pic:pic>
               </a:graphicData>
             </a:graphic>
+            <wp14:sizeRelH relativeFrom="margin">
+              <wp14:pctWidth>0</wp14:pctWidth>
+            </wp14:sizeRelH>
           </wp:anchor>
         </w:drawing>
       </w:r>
@@ -535,43 +541,92 @@
     <w:p>
       <w:pPr>
         <w:pStyle w:val="Textoindependiente2"/>
-        <w:ind w:left="5664" w:firstLine="290"/>
+        <w:ind w:left="5760" w:firstLine="290"/>
+        <w:jc w:val="center"/>
         <w:rPr>
           <w:rFonts w:cs="Arial"/>
+          <w:b/>
+          <w:sz w:val="18"/>
           <w:szCs w:val="24"/>
           <w:lang w:val="es-PE"/>
         </w:rPr>
       </w:pPr>
+      <w:r>
+        <w:rPr>
+          <w:rFonts w:cs="Arial"/>
+          <w:b/>
+          <w:sz w:val="18"/>
+          <w:szCs w:val="24"/>
+          <w:lang w:val="es-PE"/>
+        </w:rPr>
+        <w:t>{comisario_oa}</w:t>
+      </w:r>
     </w:p>
     <w:p>
       <w:pPr>
-        <w:spacing w:before="240"/>
-        <w:jc w:val="right"/>
+        <w:spacing w:after="0"/>
+        <w:ind w:left="5760"/>
+        <w:jc w:val="center"/>
         <w:rPr>
           <w:rFonts w:ascii="Arial" w:hAnsi="Arial" w:cs="Arial"/>
-          <w:sz w:val="24"/>
+          <w:b/>
+          <w:sz w:val="18"/>
           <w:szCs w:val="24"/>
         </w:rPr>
       </w:pPr>
+      <w:r>
+        <w:rPr>
+          <w:rFonts w:ascii="Arial" w:hAnsi="Arial" w:cs="Arial"/>
+          <w:b/>
+          <w:sz w:val="18"/>
+          <w:szCs w:val="24"/>
+        </w:rPr>
+        <w:t>{comisario_nombre}</w:t>
+      </w:r>
     </w:p>
     <w:p>
       <w:pPr>
-        <w:spacing w:before="240"/>
-        <w:jc w:val="right"/>
+        <w:spacing w:after="0"/>
+        <w:ind w:left="5760"/>
+        <w:jc w:val="center"/>
         <w:rPr>
           <w:rFonts w:ascii="Arial" w:hAnsi="Arial" w:cs="Arial"/>
-          <w:sz w:val="24"/>
+          <w:b/>
+          <w:sz w:val="18"/>
           <w:szCs w:val="24"/>
         </w:rPr>
       </w:pPr>
+      <w:r>
+        <w:rPr>
+          <w:rFonts w:ascii="Arial" w:hAnsi="Arial" w:cs="Arial"/>
+          <w:b/>
+          <w:sz w:val="18"/>
+          <w:szCs w:val="24"/>
+        </w:rPr>
+        <w:t>{comisario_grado}</w:t>
+      </w:r>
     </w:p>
     <w:p>
       <w:pPr>
         <w:pStyle w:val="Textoindependiente2"/>
-        <w:rPr>
+        <w:ind w:left="5760"/>
+        <w:jc w:val="center"/>
+        <w:rPr>
+          <w:rFonts w:cs="Arial"/>
+          <w:b/>
+          <w:sz w:val="18"/>
           <w:lang w:val="es-PE"/>
         </w:rPr>
       </w:pPr>
+      <w:r>
+        <w:rPr>
+          <w:rFonts w:cs="Arial"/>
+          <w:b/>
+          <w:sz w:val="18"/>
+          <w:lang w:val="es-PE"/>
+        </w:rPr>
+        <w:t>{comisario_cargo}</w:t>
+      </w:r>
     </w:p>
     <w:p>
       <w:pPr>
@@ -917,6 +972,7 @@
 
 <file path=word/header1.xml><?xml version="1.0" encoding="utf-8"?>
 <w:hdr xmlns:wpc="http://schemas.microsoft.com/office/word/2010/wordprocessingCanvas" xmlns:cx="http://schemas.microsoft.com/office/drawing/2014/chartex" xmlns:cx1="http://schemas.microsoft.com/office/drawing/2015/9/8/chartex" xmlns:cx2="http://schemas.microsoft.com/office/drawing/2015/10/21/chartex" xmlns:cx3="http://schemas.microsoft.com/office/drawing/2016/5/9/chartex" xmlns:cx4="http://schemas.microsoft.com/office/drawing/2016/5/10/chartex" xmlns:cx5="http://schemas.microsoft.com/office/drawing/2016/5/11/chartex" xmlns:cx6="http://schemas.microsoft.com/office/drawing/2016/5/12/chartex" xmlns:cx7="http://schemas.microsoft.com/office/drawing/2016/5/13/chartex" xmlns:cx8="http://schemas.microsoft.com/office/drawing/2016/5/14/chartex" xmlns:mc="http://schemas.openxmlformats.org/markup-compatibility/2006" xmlns:aink="http://schemas.microsoft.com/office/drawing/2016/ink" xmlns:am3d="http://schemas.microsoft.com/office/drawing/2017/model3d" xmlns:o="urn:schemas-microsoft-com:office:office" xmlns:oel="http://schemas.microsoft.com/office/2019/extlst" xmlns:r="http://schemas.openxmlformats.org/officeDocument/2006/relationships" xmlns:m="http://schemas.openxmlformats.org/officeDocument/2006/math" xmlns:v="urn:schemas-microsoft-com:vml" xmlns:wp14="http://schemas.microsoft.com/office/word/2010/wordprocessingDrawing" xmlns:wp="http://schemas.openxmlformats.org/drawingml/2006/wordprocessingDrawing" xmlns:w10="urn:schemas-microsoft-com:office:word" xmlns:w="http://schemas.openxmlformats.org/wordprocessingml/2006/main" xmlns:w14="http://schemas.microsoft.com/office/word/2010/wordml" xmlns:w15="http://schemas.microsoft.com/office/word/2012/wordml" xmlns:w16cex="http://schemas.microsoft.com/office/word/2018/wordml/cex" xmlns:w16cid="http://schemas.microsoft.com/office/word/2016/wordml/cid" xmlns:w16="http://schemas.microsoft.com/office/word/2018/wordml" xmlns:w16du="http://schemas.microsoft.com/office/word/2023/wordml/word16du" xmlns:w16sdtdh="http://schemas.microsoft.com/office/word/2020/wordml/sdtdatahash" xmlns:w16sdtfl="http://schemas.microsoft.com/office/word/2024/wordml/sdtformatlock" xmlns:w16se="http://schemas.microsoft.com/office/word/2015/wordml/symex" xmlns:wpg="http://schemas.microsoft.com/office/word/2010/wordprocessingGroup" xmlns:wpi="http://schemas.microsoft.com/office/word/2010/wordprocessingInk" xmlns:wne="http://schemas.microsoft.com/office/word/2006/wordml" xmlns:wps="http://schemas.microsoft.com/office/word/2010/wordprocessingShape" mc:Ignorable="w14 w15 w16se w16cid w16 w16cex w16sdtdh w16sdtfl w16du wp14">
+  <w:bookmarkStart w:id="0" w:name="_Hlk52007214"/>
   <w:p>
     <w:pPr>
       <w:pStyle w:val="Encabezado"/>
@@ -931,7 +987,6 @@
         <w:szCs w:val="24"/>
       </w:rPr>
     </w:pPr>
-    <w:bookmarkStart w:id="0" w:name="_Hlk52007214"/>
     <w:r>
       <w:rPr>
         <w:rFonts w:ascii="Impact" w:hAnsi="Impact" w:cs="Arial"/>
@@ -3164,6 +3219,7 @@
   <w:style w:type="character" w:default="1" w:styleId="Fuentedeprrafopredeter">
     <w:name w:val="Default Paragraph Font"/>
     <w:uiPriority w:val="1"/>
+    <w:semiHidden/>
     <w:unhideWhenUsed/>
   </w:style>
   <w:style w:type="table" w:default="1" w:styleId="Tablanormal">

</xml_diff>